<commit_message>
productivity-wages project charts modifications
</commit_message>
<xml_diff>
--- a/ces_elasticity/docs/methodology/CES_Project_Methodology/Backup of CES_Project_Methodology.docx
+++ b/ces_elasticity/docs/methodology/CES_Project_Methodology/Backup of CES_Project_Methodology.docx
@@ -45,6 +45,7 @@
     <w:p>
       <w:pPr>
         <w:pStyle w:val="Subtitle"/>
+        <w:spacing w:after="0"/>
         <w:jc w:val="center"/>
       </w:pPr>
       <w:r>
@@ -54,13 +55,7 @@
         <w:t>variable definitions</w:t>
       </w:r>
       <w:r>
-        <w:t>, empirical pipeline, caveats, and Python</w:t>
-      </w:r>
-      <w:r>
-        <w:t xml:space="preserve"> </w:t>
-      </w:r>
-      <w:r>
-        <w:t>implementation</w:t>
+        <w:t>, empirical pipeline, caveats</w:t>
       </w:r>
     </w:p>
     <w:p>
@@ -68,33 +63,9 @@
         <w:spacing w:after="0" w:line="240" w:lineRule="auto"/>
         <w:rPr>
           <w:rFonts w:ascii="Calibri" w:hAnsi="Calibri" w:cs="Calibri"/>
-        </w:rPr>
-      </w:pPr>
-      <w:r>
-        <w:rPr>
-          <w:rFonts w:ascii="Calibri" w:hAnsi="Calibri" w:cs="Calibri"/>
           <w:b/>
         </w:rPr>
-        <w:t xml:space="preserve">Purpose. </w:t>
-      </w:r>
-      <w:r>
-        <w:rPr>
-          <w:rFonts w:ascii="Calibri" w:hAnsi="Calibri" w:cs="Calibri"/>
-        </w:rPr>
-        <w:t xml:space="preserve">This document </w:t>
-      </w:r>
-      <w:r>
-        <w:rPr>
-          <w:rFonts w:ascii="Calibri" w:hAnsi="Calibri" w:cs="Calibri"/>
-        </w:rPr>
-        <w:t xml:space="preserve">defines </w:t>
-      </w:r>
-      <w:r>
-        <w:rPr>
-          <w:rFonts w:ascii="Calibri" w:hAnsi="Calibri" w:cs="Calibri"/>
-        </w:rPr>
-        <w:t>the theoretical equation to be estimated, the exact variables to use from AMECO and the OECD Productivity Database, the rationale for splitting the analysis into a level specification and two growth specifications, the main caveats, and the Python workflow needed to move from raw CSV files to correlations, charts, and regressions.</w:t>
-      </w:r>
+      </w:pPr>
     </w:p>
     <w:p>
       <w:pPr>
@@ -103,9 +74,42 @@
           <w:rFonts w:ascii="Calibri" w:hAnsi="Calibri" w:cs="Calibri"/>
         </w:rPr>
       </w:pPr>
+      <w:r>
+        <w:rPr>
+          <w:rFonts w:ascii="Calibri" w:hAnsi="Calibri" w:cs="Calibri"/>
+          <w:b/>
+        </w:rPr>
+        <w:t xml:space="preserve">Purpose. </w:t>
+      </w:r>
+      <w:r>
+        <w:rPr>
+          <w:rFonts w:ascii="Calibri" w:hAnsi="Calibri" w:cs="Calibri"/>
+        </w:rPr>
+        <w:t xml:space="preserve">This document </w:t>
+      </w:r>
+      <w:r>
+        <w:rPr>
+          <w:rFonts w:ascii="Calibri" w:hAnsi="Calibri" w:cs="Calibri"/>
+        </w:rPr>
+        <w:t xml:space="preserve">defines </w:t>
+      </w:r>
+      <w:r>
+        <w:rPr>
+          <w:rFonts w:ascii="Calibri" w:hAnsi="Calibri" w:cs="Calibri"/>
+        </w:rPr>
+        <w:t>the theoretical equation to be estimated, the exact variables to use from AMECO and the OECD Productivity Database, the rationale for splitting the analysis into a level specification and two growth specifications, the main caveats, and the Python workflow needed to move from raw CSV files to correlations, charts, and regressions.</w:t>
+      </w:r>
     </w:p>
     <w:p>
       <w:pPr>
+        <w:spacing w:after="0" w:line="240" w:lineRule="auto"/>
+        <w:rPr>
+          <w:rFonts w:ascii="Calibri" w:hAnsi="Calibri" w:cs="Calibri"/>
+        </w:rPr>
+      </w:pPr>
+    </w:p>
+    <w:p>
+      <w:pPr>
         <w:pStyle w:val="Heading1"/>
         <w:spacing w:before="0" w:line="240" w:lineRule="auto"/>
         <w:rPr>
@@ -503,41 +507,133 @@
           <w:rFonts w:ascii="Calibri" w:hAnsi="Calibri" w:cs="Calibri"/>
         </w:rPr>
       </w:pPr>
+      <w:r>
+        <w:rPr>
+          <w:rFonts w:ascii="Calibri" w:hAnsi="Calibri" w:cs="Calibri"/>
+        </w:rPr>
+        <w:t>3.1 Output: GDP at market prices, GDP at factor cost, and GVA at basic prices</w:t>
+      </w:r>
     </w:p>
     <w:p>
       <w:pPr>
+        <w:spacing w:after="0" w:line="240" w:lineRule="auto"/>
+        <w:rPr>
+          <w:rFonts w:ascii="Calibri" w:hAnsi="Calibri" w:cs="Calibri"/>
+        </w:rPr>
+      </w:pPr>
+      <w:r>
+        <w:rPr>
+          <w:rFonts w:ascii="Calibri" w:hAnsi="Calibri" w:cs="Calibri"/>
+          <w:b/>
+        </w:rPr>
+        <w:t xml:space="preserve">GDP at market prices (GDPmp). </w:t>
+      </w:r>
+      <w:r>
+        <w:rPr>
+          <w:rFonts w:ascii="Calibri" w:hAnsi="Calibri" w:cs="Calibri"/>
+        </w:rPr>
+        <w:t>This is the broadest nominal output concept. It includes factor incomes and both types of tax wedges: taxes on products (for example VAT and excise duties) and taxes on production.</w:t>
+      </w:r>
+    </w:p>
+    <w:p>
+      <w:pPr>
+        <w:spacing w:after="0" w:line="240" w:lineRule="auto"/>
+        <w:rPr>
+          <w:rFonts w:ascii="Calibri" w:hAnsi="Calibri" w:cs="Calibri"/>
+        </w:rPr>
+      </w:pPr>
+      <w:r>
+        <w:rPr>
+          <w:rFonts w:ascii="Calibri" w:hAnsi="Calibri" w:cs="Calibri"/>
+          <w:b/>
+        </w:rPr>
+        <w:t xml:space="preserve">GDP at factor cost (GDPfc). </w:t>
+      </w:r>
+      <w:r>
+        <w:rPr>
+          <w:rFonts w:ascii="Calibri" w:hAnsi="Calibri" w:cs="Calibri"/>
+        </w:rPr>
+        <w:t>This removes the net product-tax wedge and the net production-tax wedge. In functional-distribution terms, GDP at factor cost is the cleanest output concept for a production-function exercise because it corresponds to factor remuneration only:</w:t>
+      </w:r>
+    </w:p>
+    <w:p>
+      <w:pPr>
+        <w:spacing w:after="0" w:line="240" w:lineRule="auto"/>
+        <w:rPr>
+          <w:rFonts w:ascii="Calibri" w:hAnsi="Calibri" w:cs="Calibri"/>
+        </w:rPr>
+      </w:pPr>
+      <w:r>
+        <w:rPr>
+          <w:rFonts w:ascii="Calibri" w:hAnsi="Calibri" w:cs="Calibri"/>
+        </w:rPr>
+        <w:t>GDPfc = COE + GOS + Mixed Income</w:t>
+      </w:r>
+    </w:p>
+    <w:p>
+      <w:pPr>
+        <w:spacing w:after="0" w:line="240" w:lineRule="auto"/>
+        <w:rPr>
+          <w:rFonts w:ascii="Calibri" w:hAnsi="Calibri" w:cs="Calibri"/>
+        </w:rPr>
+      </w:pPr>
+      <w:r>
+        <w:rPr>
+          <w:rFonts w:ascii="Calibri" w:hAnsi="Calibri" w:cs="Calibri"/>
+          <w:b/>
+        </w:rPr>
+        <w:t xml:space="preserve">GVA at basic prices (GVAbp). </w:t>
+      </w:r>
+      <w:r>
+        <w:rPr>
+          <w:rFonts w:ascii="Calibri" w:hAnsi="Calibri" w:cs="Calibri"/>
+        </w:rPr>
+        <w:t>This is the OECD production-side output measure and equals output minus intermediate consumption. It excludes taxes on products but still includes net taxes on production. Therefore GVAbp is closer to GDPfc than to GDPmp, but it is not identical to factor cost.</w:t>
+      </w:r>
+    </w:p>
+    <w:p>
+      <w:pPr>
+        <w:spacing w:after="0" w:line="240" w:lineRule="auto"/>
+        <w:rPr>
+          <w:rFonts w:ascii="Calibri" w:hAnsi="Calibri" w:cs="Calibri"/>
+        </w:rPr>
+      </w:pPr>
+      <w:r>
+        <w:rPr>
+          <w:rFonts w:ascii="Calibri" w:hAnsi="Calibri" w:cs="Calibri"/>
+          <w:b/>
+        </w:rPr>
+        <w:t xml:space="preserve">Why this matters. </w:t>
+      </w:r>
+      <w:r>
+        <w:rPr>
+          <w:rFonts w:ascii="Calibri" w:hAnsi="Calibri" w:cs="Calibri"/>
+        </w:rPr>
+        <w:t>For CES estimation, GDPfc is theoretically preferable because it aligns with factor income. However, the OECD Productivity Database is built around GVA at basic prices, which is the standard output measure in productivity analysis. This is acceptable in the growth specifications, but it must be stated explicitly.</w:t>
+      </w:r>
+    </w:p>
+    <w:p>
+      <w:pPr>
         <w:pStyle w:val="Heading2"/>
         <w:spacing w:before="0" w:line="240" w:lineRule="auto"/>
         <w:rPr>
           <w:rFonts w:ascii="Calibri" w:hAnsi="Calibri" w:cs="Calibri"/>
         </w:rPr>
       </w:pPr>
-      <w:r>
-        <w:rPr>
-          <w:rFonts w:ascii="Calibri" w:hAnsi="Calibri" w:cs="Calibri"/>
-        </w:rPr>
-        <w:t>3.1 Output: GDP at market prices, GDP at factor cost, and GVA at basic prices</w:t>
-      </w:r>
     </w:p>
     <w:p>
       <w:pPr>
-        <w:spacing w:after="0" w:line="240" w:lineRule="auto"/>
-        <w:rPr>
-          <w:rFonts w:ascii="Calibri" w:hAnsi="Calibri" w:cs="Calibri"/>
-        </w:rPr>
-      </w:pPr>
-      <w:r>
-        <w:rPr>
-          <w:rFonts w:ascii="Calibri" w:hAnsi="Calibri" w:cs="Calibri"/>
-          <w:b/>
-        </w:rPr>
-        <w:t xml:space="preserve">GDP at market prices (GDPmp). </w:t>
-      </w:r>
-      <w:r>
-        <w:rPr>
-          <w:rFonts w:ascii="Calibri" w:hAnsi="Calibri" w:cs="Calibri"/>
-        </w:rPr>
-        <w:t>This is the broadest nominal output concept. It includes factor incomes and both types of tax wedges: taxes on products (for example VAT and excise duties) and taxes on production.</w:t>
+        <w:pStyle w:val="Heading2"/>
+        <w:spacing w:before="0" w:line="240" w:lineRule="auto"/>
+        <w:rPr>
+          <w:rFonts w:ascii="Calibri" w:hAnsi="Calibri" w:cs="Calibri"/>
+        </w:rPr>
+      </w:pPr>
+      <w:r>
+        <w:rPr>
+          <w:rFonts w:ascii="Calibri" w:hAnsi="Calibri" w:cs="Calibri"/>
+        </w:rPr>
+        <w:t>3.2 Labour share: AMECO vs OECD</w:t>
       </w:r>
     </w:p>
     <w:p>
@@ -552,13 +648,13 @@
           <w:rFonts w:ascii="Calibri" w:hAnsi="Calibri" w:cs="Calibri"/>
           <w:b/>
         </w:rPr>
-        <w:t xml:space="preserve">GDP at factor cost (GDPfc). </w:t>
-      </w:r>
-      <w:r>
-        <w:rPr>
-          <w:rFonts w:ascii="Calibri" w:hAnsi="Calibri" w:cs="Calibri"/>
-        </w:rPr>
-        <w:t>This removes the net product-tax wedge and the net production-tax wedge. In functional-distribution terms, GDP at factor cost is the cleanest output concept for a production-function exercise because it corresponds to factor remuneration only:</w:t>
+        <w:t xml:space="preserve">AMECO labour share (ALCD2). </w:t>
+      </w:r>
+      <w:r>
+        <w:rPr>
+          <w:rFonts w:ascii="Calibri" w:hAnsi="Calibri" w:cs="Calibri"/>
+        </w:rPr>
+        <w:t>The preferred labour-share measure for the level specification is AMECO ALCD2, the adjusted wage share as a percentage of GDP at current factor cost. Its numerator is compensation of employees adjusted for self-employed labour income. The adjustment uses the standard assumption that self-employed workers receive the same average labour income as employees. In compact notation:</w:t>
       </w:r>
     </w:p>
     <w:p>
@@ -572,7 +668,7 @@
         <w:rPr>
           <w:rFonts w:ascii="Calibri" w:hAnsi="Calibri" w:cs="Calibri"/>
         </w:rPr>
-        <w:t>GDPfc = COE + GOS + Mixed Income</w:t>
+        <w:t>COEadj = COE × (L / E)</w:t>
       </w:r>
     </w:p>
     <w:p>
@@ -585,15 +681,8 @@
       <w:r>
         <w:rPr>
           <w:rFonts w:ascii="Calibri" w:hAnsi="Calibri" w:cs="Calibri"/>
-          <w:b/>
-        </w:rPr>
-        <w:t xml:space="preserve">GVA at basic prices (GVAbp). </w:t>
-      </w:r>
-      <w:r>
-        <w:rPr>
-          <w:rFonts w:ascii="Calibri" w:hAnsi="Calibri" w:cs="Calibri"/>
-        </w:rPr>
-        <w:t>This is the OECD production-side output measure and equals output minus intermediate consumption. It excludes taxes on products but still includes net taxes on production. Therefore GVAbp is closer to GDPfc than to GDPmp, but it is not identical to factor cost.</w:t>
+        </w:rPr>
+        <w:t>sL = COEadj / GDPfc</w:t>
       </w:r>
     </w:p>
     <w:p>
@@ -608,28 +697,34 @@
           <w:rFonts w:ascii="Calibri" w:hAnsi="Calibri" w:cs="Calibri"/>
           <w:b/>
         </w:rPr>
-        <w:t xml:space="preserve">Why this matters. </w:t>
-      </w:r>
-      <w:r>
-        <w:rPr>
-          <w:rFonts w:ascii="Calibri" w:hAnsi="Calibri" w:cs="Calibri"/>
-        </w:rPr>
-        <w:t>For CES estimation, GDPfc is theoretically preferable because it aligns with factor income. However, the OECD Productivity Database is built around GVA at basic prices, which is the standard output measure in productivity analysis. This is acceptable in the growth specifications, but it must be stated explicitly.</w:t>
+        <w:t xml:space="preserve">Why ALCD2 is preferred. </w:t>
+      </w:r>
+      <w:r>
+        <w:rPr>
+          <w:rFonts w:ascii="Calibri" w:hAnsi="Calibri" w:cs="Calibri"/>
+        </w:rPr>
+        <w:t>It is adjusted for self-employment and uses GDP at factor cost in the denominator. For a CES framework, this is the cleanest share measure available in the data sources used.</w:t>
       </w:r>
     </w:p>
     <w:p>
       <w:pPr>
-        <w:pStyle w:val="Heading2"/>
-        <w:spacing w:line="240" w:lineRule="auto"/>
-        <w:rPr>
-          <w:rFonts w:ascii="Calibri" w:hAnsi="Calibri" w:cs="Calibri"/>
-        </w:rPr>
-      </w:pPr>
-      <w:r>
-        <w:rPr>
-          <w:rFonts w:ascii="Calibri" w:hAnsi="Calibri" w:cs="Calibri"/>
-        </w:rPr>
-        <w:t>3.2 Labour share: AMECO vs OECD</w:t>
+        <w:spacing w:after="0" w:line="240" w:lineRule="auto"/>
+        <w:rPr>
+          <w:rFonts w:ascii="Calibri" w:hAnsi="Calibri" w:cs="Calibri"/>
+        </w:rPr>
+      </w:pPr>
+      <w:r>
+        <w:rPr>
+          <w:rFonts w:ascii="Calibri" w:hAnsi="Calibri" w:cs="Calibri"/>
+          <w:b/>
+        </w:rPr>
+        <w:t xml:space="preserve">AMECO ALCD0. </w:t>
+      </w:r>
+      <w:r>
+        <w:rPr>
+          <w:rFonts w:ascii="Calibri" w:hAnsi="Calibri" w:cs="Calibri"/>
+        </w:rPr>
+        <w:t>ALCD0 is the adjusted wage share expressed as a percentage of GDP at current market prices. It is useful for comparison, but not as the main CES share, because the denominator includes tax wedges unrelated to factor remuneration.</w:t>
       </w:r>
     </w:p>
     <w:p>
@@ -644,13 +739,13 @@
           <w:rFonts w:ascii="Calibri" w:hAnsi="Calibri" w:cs="Calibri"/>
           <w:b/>
         </w:rPr>
-        <w:t xml:space="preserve">AMECO labour share (ALCD2). </w:t>
-      </w:r>
-      <w:r>
-        <w:rPr>
-          <w:rFonts w:ascii="Calibri" w:hAnsi="Calibri" w:cs="Calibri"/>
-        </w:rPr>
-        <w:t>The preferred labour-share measure for the level specification is AMECO ALCD2, the adjusted wage share as a percentage of GDP at current factor cost. Its numerator is compensation of employees adjusted for self-employed labour income. The adjustment uses the standard assumption that self-employed workers receive the same average labour income as employees. In compact notation:</w:t>
+        <w:t xml:space="preserve">OECD labour share. </w:t>
+      </w:r>
+      <w:r>
+        <w:rPr>
+          <w:rFonts w:ascii="Calibri" w:hAnsi="Calibri" w:cs="Calibri"/>
+        </w:rPr>
+        <w:t>At total-economy or sector level in OECD data, labour share must be constructed. The natural construction is:</w:t>
       </w:r>
     </w:p>
     <w:p>
@@ -664,7 +759,7 @@
         <w:rPr>
           <w:rFonts w:ascii="Calibri" w:hAnsi="Calibri" w:cs="Calibri"/>
         </w:rPr>
-        <w:t>COEadj = COE × (L / E)</w:t>
+        <w:t>sL = LC / GVA</w:t>
       </w:r>
     </w:p>
     <w:p>
@@ -677,8 +772,15 @@
       <w:r>
         <w:rPr>
           <w:rFonts w:ascii="Calibri" w:hAnsi="Calibri" w:cs="Calibri"/>
-        </w:rPr>
-        <w:t>sL = COEadj / GDPfc</w:t>
+          <w:b/>
+        </w:rPr>
+        <w:t xml:space="preserve">Meaning of LC. </w:t>
+      </w:r>
+      <w:r>
+        <w:rPr>
+          <w:rFonts w:ascii="Calibri" w:hAnsi="Calibri" w:cs="Calibri"/>
+        </w:rPr>
+        <w:t>Labour compensation includes wages and salaries plus employers’ social contributions. In the OECD productivity framework, self-employed labour income is not directly observed and is approximated under the assumption that self-employed persons receive the same average remuneration as employees. In other words, the OECD framework uses the same basic logic of self-employed imputation, though the exact series are embedded within the productivity methodology.</w:t>
       </w:r>
     </w:p>
     <w:p>
@@ -693,55 +795,37 @@
           <w:rFonts w:ascii="Calibri" w:hAnsi="Calibri" w:cs="Calibri"/>
           <w:b/>
         </w:rPr>
-        <w:t xml:space="preserve">Why ALCD2 is preferred. </w:t>
-      </w:r>
-      <w:r>
-        <w:rPr>
-          <w:rFonts w:ascii="Calibri" w:hAnsi="Calibri" w:cs="Calibri"/>
-        </w:rPr>
-        <w:t>It is adjusted for self-employment and uses GDP at factor cost in the denominator. For a CES framework, this is the cleanest share measure available in the data sources used.</w:t>
+        <w:t xml:space="preserve">Main difference relative to AMECO. </w:t>
+      </w:r>
+      <w:r>
+        <w:rPr>
+          <w:rFonts w:ascii="Calibri" w:hAnsi="Calibri" w:cs="Calibri"/>
+        </w:rPr>
+        <w:t>AMECO level shares are defined over GDP at factor cost. OECD growth and sectoral shares are constructed over GVA at basic prices. Therefore the OECD share is not identical to ALCD2, although in practice the two may be close.</w:t>
       </w:r>
     </w:p>
     <w:p>
       <w:pPr>
-        <w:spacing w:after="0" w:line="240" w:lineRule="auto"/>
-        <w:rPr>
-          <w:rFonts w:ascii="Calibri" w:hAnsi="Calibri" w:cs="Calibri"/>
-        </w:rPr>
-      </w:pPr>
-      <w:r>
-        <w:rPr>
-          <w:rFonts w:ascii="Calibri" w:hAnsi="Calibri" w:cs="Calibri"/>
-          <w:b/>
-        </w:rPr>
-        <w:t xml:space="preserve">AMECO ALCD0. </w:t>
-      </w:r>
-      <w:r>
-        <w:rPr>
-          <w:rFonts w:ascii="Calibri" w:hAnsi="Calibri" w:cs="Calibri"/>
-        </w:rPr>
-        <w:t>ALCD0 is the adjusted wage share expressed as a percentage of GDP at current market prices. It is useful for comparison, but not as the main CES share, because the denominator includes tax wedges unrelated to factor remuneration.</w:t>
-      </w:r>
+        <w:pStyle w:val="Heading2"/>
+        <w:spacing w:before="0" w:line="240" w:lineRule="auto"/>
+        <w:rPr>
+          <w:rFonts w:ascii="Calibri" w:hAnsi="Calibri" w:cs="Calibri"/>
+        </w:rPr>
+      </w:pPr>
     </w:p>
     <w:p>
       <w:pPr>
-        <w:spacing w:after="0" w:line="240" w:lineRule="auto"/>
-        <w:rPr>
-          <w:rFonts w:ascii="Calibri" w:hAnsi="Calibri" w:cs="Calibri"/>
-        </w:rPr>
-      </w:pPr>
-      <w:r>
-        <w:rPr>
-          <w:rFonts w:ascii="Calibri" w:hAnsi="Calibri" w:cs="Calibri"/>
-          <w:b/>
-        </w:rPr>
-        <w:t xml:space="preserve">OECD labour share. </w:t>
-      </w:r>
-      <w:r>
-        <w:rPr>
-          <w:rFonts w:ascii="Calibri" w:hAnsi="Calibri" w:cs="Calibri"/>
-        </w:rPr>
-        <w:t>At total-economy or sector level in OECD data, labour share must be constructed. The natural construction is:</w:t>
+        <w:pStyle w:val="Heading2"/>
+        <w:spacing w:before="0" w:line="240" w:lineRule="auto"/>
+        <w:rPr>
+          <w:rFonts w:ascii="Calibri" w:hAnsi="Calibri" w:cs="Calibri"/>
+        </w:rPr>
+      </w:pPr>
+      <w:r>
+        <w:rPr>
+          <w:rFonts w:ascii="Calibri" w:hAnsi="Calibri" w:cs="Calibri"/>
+        </w:rPr>
+        <w:t>3.3 Capital: stock, services, and capital deepening</w:t>
       </w:r>
     </w:p>
     <w:p>
@@ -754,8 +838,15 @@
       <w:r>
         <w:rPr>
           <w:rFonts w:ascii="Calibri" w:hAnsi="Calibri" w:cs="Calibri"/>
-        </w:rPr>
-        <w:t>sL = LC / GVA</w:t>
+          <w:b/>
+        </w:rPr>
+        <w:t xml:space="preserve">AMECO capital stock (OKND). </w:t>
+      </w:r>
+      <w:r>
+        <w:rPr>
+          <w:rFonts w:ascii="Calibri" w:hAnsi="Calibri" w:cs="Calibri"/>
+        </w:rPr>
+        <w:t>OKND is net capital stock. It is a stock concept, not a flow concept. It is appropriate as a practical proxy for capital in the cross-country level specification because it is available in a common European monetary unit and is more manageable cross-country than OECD capital-service levels expressed in national currency.</w:t>
       </w:r>
     </w:p>
     <w:p>
@@ -770,13 +861,13 @@
           <w:rFonts w:ascii="Calibri" w:hAnsi="Calibri" w:cs="Calibri"/>
           <w:b/>
         </w:rPr>
-        <w:t xml:space="preserve">Meaning of LC. </w:t>
-      </w:r>
-      <w:r>
-        <w:rPr>
-          <w:rFonts w:ascii="Calibri" w:hAnsi="Calibri" w:cs="Calibri"/>
-        </w:rPr>
-        <w:t>Labour compensation includes wages and salaries plus employers’ social contributions. In the OECD productivity framework, self-employed labour income is not directly observed and is approximated under the assumption that self-employed persons receive the same average remuneration as employees. In other words, the OECD framework uses the same basic logic of self-employed imputation, though the exact series are embedded within the productivity methodology.</w:t>
+        <w:t xml:space="preserve">OECD capital services (KSER). </w:t>
+      </w:r>
+      <w:r>
+        <w:rPr>
+          <w:rFonts w:ascii="Calibri" w:hAnsi="Calibri" w:cs="Calibri"/>
+        </w:rPr>
+        <w:t>Capital services are the flow of productive services generated by capital assets. This is the conceptually correct capital input in productivity and growth-accounting analysis. OECD provides capital-services growth and, in some versions of the database, capital-services levels, but cross-country comparability of levels is weakened because the level series are expressed in national currency.</w:t>
       </w:r>
     </w:p>
     <w:p>
@@ -791,28 +882,29 @@
           <w:rFonts w:ascii="Calibri" w:hAnsi="Calibri" w:cs="Calibri"/>
           <w:b/>
         </w:rPr>
-        <w:t xml:space="preserve">Main difference relative to AMECO. </w:t>
-      </w:r>
-      <w:r>
-        <w:rPr>
-          <w:rFonts w:ascii="Calibri" w:hAnsi="Calibri" w:cs="Calibri"/>
-        </w:rPr>
-        <w:t>AMECO level shares are defined over GDP at factor cost. OECD growth and sectoral shares are constructed over GVA at basic prices. Therefore the OECD share is not identical to ALCD2, although in practice the two may be close.</w:t>
+        <w:lastRenderedPageBreak/>
+        <w:t xml:space="preserve">OECD capital deepening (KSERHRS). </w:t>
+      </w:r>
+      <w:r>
+        <w:rPr>
+          <w:rFonts w:ascii="Calibri" w:hAnsi="Calibri" w:cs="Calibri"/>
+        </w:rPr>
+        <w:t>Capital deepening is defined as capital services per hour worked. In the project it is used in growth form. It is not capital stock per hour. This distinction matters because a CES production function conceptually uses productive capital input, not a balance-sheet measure of capital.</w:t>
       </w:r>
     </w:p>
     <w:p>
       <w:pPr>
         <w:pStyle w:val="Heading2"/>
-        <w:spacing w:line="240" w:lineRule="auto"/>
-        <w:rPr>
-          <w:rFonts w:ascii="Calibri" w:hAnsi="Calibri" w:cs="Calibri"/>
-        </w:rPr>
-      </w:pPr>
-      <w:r>
-        <w:rPr>
-          <w:rFonts w:ascii="Calibri" w:hAnsi="Calibri" w:cs="Calibri"/>
-        </w:rPr>
-        <w:t>3.3 Capital: stock, services, and capital deepening</w:t>
+        <w:spacing w:before="0" w:line="240" w:lineRule="auto"/>
+        <w:rPr>
+          <w:rFonts w:ascii="Calibri" w:hAnsi="Calibri" w:cs="Calibri"/>
+        </w:rPr>
+      </w:pPr>
+      <w:r>
+        <w:rPr>
+          <w:rFonts w:ascii="Calibri" w:hAnsi="Calibri" w:cs="Calibri"/>
+        </w:rPr>
+        <w:t>3.4 Labour input</w:t>
       </w:r>
     </w:p>
     <w:p>
@@ -827,13 +919,13 @@
           <w:rFonts w:ascii="Calibri" w:hAnsi="Calibri" w:cs="Calibri"/>
           <w:b/>
         </w:rPr>
-        <w:t xml:space="preserve">AMECO capital stock (OKND). </w:t>
-      </w:r>
-      <w:r>
-        <w:rPr>
-          <w:rFonts w:ascii="Calibri" w:hAnsi="Calibri" w:cs="Calibri"/>
-        </w:rPr>
-        <w:t>OKND is net capital stock. It is a stock concept, not a flow concept. It is appropriate as a practical proxy for capital in the cross-country level specification because it is available in a common European monetary unit and is more manageable cross-country than OECD capital-service levels expressed in national currency.</w:t>
+        <w:t xml:space="preserve">Hours worked. </w:t>
+      </w:r>
+      <w:r>
+        <w:rPr>
+          <w:rFonts w:ascii="Calibri" w:hAnsi="Calibri" w:cs="Calibri"/>
+        </w:rPr>
+        <w:t>Both AMECO and OECD provide hours-worked variables as level series, not as pre-computed growth rates:</w:t>
       </w:r>
     </w:p>
     <w:p>
@@ -846,15 +938,8 @@
       <w:r>
         <w:rPr>
           <w:rFonts w:ascii="Calibri" w:hAnsi="Calibri" w:cs="Calibri"/>
-          <w:b/>
-        </w:rPr>
-        <w:t xml:space="preserve">OECD capital services (KSER). </w:t>
-      </w:r>
-      <w:r>
-        <w:rPr>
-          <w:rFonts w:ascii="Calibri" w:hAnsi="Calibri" w:cs="Calibri"/>
-        </w:rPr>
-        <w:t>Capital services are the flow of productive services generated by capital assets. This is the conceptually correct capital input in productivity and growth-accounting analysis. OECD provides capital-services growth and, in some versions of the database, capital-services levels, but cross-country comparability of levels is weakened because the level series are expressed in national currency.</w:t>
+        </w:rPr>
+        <w:t>AMECO: NLHT = total hours worked</w:t>
       </w:r>
     </w:p>
     <w:p>
@@ -867,31 +952,29 @@
       <w:r>
         <w:rPr>
           <w:rFonts w:ascii="Calibri" w:hAnsi="Calibri" w:cs="Calibri"/>
-          <w:b/>
-        </w:rPr>
-        <w:lastRenderedPageBreak/>
-        <w:t xml:space="preserve">OECD capital deepening (KSERHRS). </w:t>
-      </w:r>
-      <w:r>
-        <w:rPr>
-          <w:rFonts w:ascii="Calibri" w:hAnsi="Calibri" w:cs="Calibri"/>
-        </w:rPr>
-        <w:t>Capital deepening is defined as capital services per hour worked. In the project it is used in growth form. It is not capital stock per hour. This distinction matters because a CES production function conceptually uses productive capital input, not a balance-sheet measure of capital.</w:t>
+        </w:rPr>
+        <w:t>OECD: HRSTO = hours worked for total employment</w:t>
       </w:r>
     </w:p>
     <w:p>
       <w:pPr>
-        <w:pStyle w:val="Heading2"/>
-        <w:spacing w:line="240" w:lineRule="auto"/>
-        <w:rPr>
-          <w:rFonts w:ascii="Calibri" w:hAnsi="Calibri" w:cs="Calibri"/>
-        </w:rPr>
-      </w:pPr>
-      <w:r>
-        <w:rPr>
-          <w:rFonts w:ascii="Calibri" w:hAnsi="Calibri" w:cs="Calibri"/>
-        </w:rPr>
-        <w:t>3.4 Labour input</w:t>
+        <w:spacing w:after="0" w:line="240" w:lineRule="auto"/>
+        <w:rPr>
+          <w:rFonts w:ascii="Calibri" w:hAnsi="Calibri" w:cs="Calibri"/>
+        </w:rPr>
+      </w:pPr>
+      <w:r>
+        <w:rPr>
+          <w:rFonts w:ascii="Calibri" w:hAnsi="Calibri" w:cs="Calibri"/>
+          <w:b/>
+        </w:rPr>
+        <w:t xml:space="preserve">Operational implication. </w:t>
+      </w:r>
+      <w:r>
+        <w:rPr>
+          <w:rFonts w:ascii="Calibri" w:hAnsi="Calibri" w:cs="Calibri"/>
+        </w:rPr>
+        <w:t>All growth rates of hours worked must therefore be computed in Python as first differences of logarithms:</w:t>
       </w:r>
     </w:p>
     <w:p>
@@ -904,15 +987,8 @@
       <w:r>
         <w:rPr>
           <w:rFonts w:ascii="Calibri" w:hAnsi="Calibri" w:cs="Calibri"/>
-          <w:b/>
-        </w:rPr>
-        <w:t xml:space="preserve">Hours worked. </w:t>
-      </w:r>
-      <w:r>
-        <w:rPr>
-          <w:rFonts w:ascii="Calibri" w:hAnsi="Calibri" w:cs="Calibri"/>
-        </w:rPr>
-        <w:t>Both AMECO and OECD provide hours-worked variables as level series, not as pre-computed growth rates:</w:t>
+        </w:rPr>
+        <w:t>gH = Δ ln(H)</w:t>
       </w:r>
     </w:p>
     <w:p>
@@ -922,74 +998,11 @@
           <w:rFonts w:ascii="Calibri" w:hAnsi="Calibri" w:cs="Calibri"/>
         </w:rPr>
       </w:pPr>
-      <w:r>
-        <w:rPr>
-          <w:rFonts w:ascii="Calibri" w:hAnsi="Calibri" w:cs="Calibri"/>
-        </w:rPr>
-        <w:t>AMECO: NLHT = total hours worked</w:t>
-      </w:r>
     </w:p>
     <w:p>
       <w:pPr>
-        <w:spacing w:after="0" w:line="240" w:lineRule="auto"/>
-        <w:rPr>
-          <w:rFonts w:ascii="Calibri" w:hAnsi="Calibri" w:cs="Calibri"/>
-        </w:rPr>
-      </w:pPr>
-      <w:r>
-        <w:rPr>
-          <w:rFonts w:ascii="Calibri" w:hAnsi="Calibri" w:cs="Calibri"/>
-        </w:rPr>
-        <w:t>OECD: HRSTO = hours worked for total employment</w:t>
-      </w:r>
-    </w:p>
-    <w:p>
-      <w:pPr>
-        <w:spacing w:after="0" w:line="240" w:lineRule="auto"/>
-        <w:rPr>
-          <w:rFonts w:ascii="Calibri" w:hAnsi="Calibri" w:cs="Calibri"/>
-        </w:rPr>
-      </w:pPr>
-      <w:r>
-        <w:rPr>
-          <w:rFonts w:ascii="Calibri" w:hAnsi="Calibri" w:cs="Calibri"/>
-          <w:b/>
-        </w:rPr>
-        <w:t xml:space="preserve">Operational implication. </w:t>
-      </w:r>
-      <w:r>
-        <w:rPr>
-          <w:rFonts w:ascii="Calibri" w:hAnsi="Calibri" w:cs="Calibri"/>
-        </w:rPr>
-        <w:t>All growth rates of hours worked must therefore be computed in Python as first differences of logarithms:</w:t>
-      </w:r>
-    </w:p>
-    <w:p>
-      <w:pPr>
-        <w:spacing w:after="0" w:line="240" w:lineRule="auto"/>
-        <w:rPr>
-          <w:rFonts w:ascii="Calibri" w:hAnsi="Calibri" w:cs="Calibri"/>
-        </w:rPr>
-      </w:pPr>
-      <w:r>
-        <w:rPr>
-          <w:rFonts w:ascii="Calibri" w:hAnsi="Calibri" w:cs="Calibri"/>
-        </w:rPr>
-        <w:t>gH = Δ ln(H)</w:t>
-      </w:r>
-    </w:p>
-    <w:p>
-      <w:pPr>
-        <w:spacing w:after="0" w:line="240" w:lineRule="auto"/>
-        <w:rPr>
-          <w:rFonts w:ascii="Calibri" w:hAnsi="Calibri" w:cs="Calibri"/>
-        </w:rPr>
-      </w:pPr>
-    </w:p>
-    <w:p>
-      <w:pPr>
         <w:pStyle w:val="Heading2"/>
-        <w:spacing w:line="240" w:lineRule="auto"/>
+        <w:spacing w:before="0" w:line="240" w:lineRule="auto"/>
         <w:rPr>
           <w:rFonts w:ascii="Calibri" w:hAnsi="Calibri" w:cs="Calibri"/>
         </w:rPr>
@@ -1911,6 +1924,14 @@
     </w:p>
     <w:p>
       <w:pPr>
+        <w:spacing w:after="0" w:line="240" w:lineRule="auto"/>
+        <w:rPr>
+          <w:rFonts w:ascii="Calibri" w:hAnsi="Calibri" w:cs="Calibri"/>
+        </w:rPr>
+      </w:pPr>
+    </w:p>
+    <w:p>
+      <w:pPr>
         <w:pStyle w:val="Heading1"/>
         <w:spacing w:before="0" w:line="240" w:lineRule="auto"/>
         <w:rPr>
@@ -1928,7 +1949,7 @@
     <w:p>
       <w:pPr>
         <w:pStyle w:val="Heading2"/>
-        <w:spacing w:line="240" w:lineRule="auto"/>
+        <w:spacing w:before="0" w:line="240" w:lineRule="auto"/>
         <w:rPr>
           <w:rFonts w:ascii="Calibri" w:hAnsi="Calibri" w:cs="Calibri"/>
         </w:rPr>
@@ -2118,37 +2139,25 @@
     <w:p>
       <w:pPr>
         <w:pStyle w:val="Heading2"/>
-        <w:spacing w:line="240" w:lineRule="auto"/>
-        <w:rPr>
-          <w:rFonts w:ascii="Calibri" w:hAnsi="Calibri" w:cs="Calibri"/>
-        </w:rPr>
-      </w:pPr>
-      <w:r>
-        <w:rPr>
-          <w:rFonts w:ascii="Calibri" w:hAnsi="Calibri" w:cs="Calibri"/>
-        </w:rPr>
-        <w:t>5.2 Model 2: Non-sectoral growth panel (OECD, G7 economies)</w:t>
-      </w:r>
+        <w:spacing w:before="0" w:line="240" w:lineRule="auto"/>
+        <w:rPr>
+          <w:rFonts w:ascii="Calibri" w:hAnsi="Calibri" w:cs="Calibri"/>
+        </w:rPr>
+      </w:pPr>
     </w:p>
     <w:p>
       <w:pPr>
-        <w:spacing w:after="0" w:line="240" w:lineRule="auto"/>
-        <w:rPr>
-          <w:rFonts w:ascii="Calibri" w:hAnsi="Calibri" w:cs="Calibri"/>
-        </w:rPr>
-      </w:pPr>
-      <w:r>
-        <w:rPr>
-          <w:rFonts w:ascii="Calibri" w:hAnsi="Calibri" w:cs="Calibri"/>
-          <w:b/>
-        </w:rPr>
-        <w:t xml:space="preserve">Scope. </w:t>
-      </w:r>
-      <w:r>
-        <w:rPr>
-          <w:rFonts w:ascii="Calibri" w:hAnsi="Calibri" w:cs="Calibri"/>
-        </w:rPr>
-        <w:t>This specification exploits time variation within G7 economies. It is necessary because the OECD dynamic variables are the most suitable ones for capturing capital input as capital services rather than as capital stock.</w:t>
+        <w:pStyle w:val="Heading2"/>
+        <w:spacing w:before="0" w:line="240" w:lineRule="auto"/>
+        <w:rPr>
+          <w:rFonts w:ascii="Calibri" w:hAnsi="Calibri" w:cs="Calibri"/>
+        </w:rPr>
+      </w:pPr>
+      <w:r>
+        <w:rPr>
+          <w:rFonts w:ascii="Calibri" w:hAnsi="Calibri" w:cs="Calibri"/>
+        </w:rPr>
+        <w:t>5.2 Model 2: Non-sectoral growth panel (OECD, G7 economies)</w:t>
       </w:r>
     </w:p>
     <w:p>
@@ -2163,13 +2172,13 @@
           <w:rFonts w:ascii="Calibri" w:hAnsi="Calibri" w:cs="Calibri"/>
           <w:b/>
         </w:rPr>
-        <w:t xml:space="preserve">Construction of the dependent variable. </w:t>
-      </w:r>
-      <w:r>
-        <w:rPr>
-          <w:rFonts w:ascii="Calibri" w:hAnsi="Calibri" w:cs="Calibri"/>
-        </w:rPr>
-        <w:t>First construct the OECD labour share and then its log ratio:</w:t>
+        <w:t xml:space="preserve">Scope. </w:t>
+      </w:r>
+      <w:r>
+        <w:rPr>
+          <w:rFonts w:ascii="Calibri" w:hAnsi="Calibri" w:cs="Calibri"/>
+        </w:rPr>
+        <w:t>This specification exploits time variation within G7 economies. It is necessary because the OECD dynamic variables are the most suitable ones for capturing capital input as capital services rather than as capital stock.</w:t>
       </w:r>
     </w:p>
     <w:p>
@@ -2182,8 +2191,15 @@
       <w:r>
         <w:rPr>
           <w:rFonts w:ascii="Calibri" w:hAnsi="Calibri" w:cs="Calibri"/>
-        </w:rPr>
-        <w:t>sL = LC / GVA</w:t>
+          <w:b/>
+        </w:rPr>
+        <w:t xml:space="preserve">Construction of the dependent variable. </w:t>
+      </w:r>
+      <w:r>
+        <w:rPr>
+          <w:rFonts w:ascii="Calibri" w:hAnsi="Calibri" w:cs="Calibri"/>
+        </w:rPr>
+        <w:t>First construct the OECD labour share and then its log ratio:</w:t>
       </w:r>
     </w:p>
     <w:p>
@@ -2197,7 +2213,7 @@
         <w:rPr>
           <w:rFonts w:ascii="Calibri" w:hAnsi="Calibri" w:cs="Calibri"/>
         </w:rPr>
-        <w:t>sK = 1 − sL</w:t>
+        <w:t>sL = LC / GVA</w:t>
       </w:r>
     </w:p>
     <w:p>
@@ -2211,7 +2227,7 @@
         <w:rPr>
           <w:rFonts w:ascii="Calibri" w:hAnsi="Calibri" w:cs="Calibri"/>
         </w:rPr>
-        <w:t>y = ln(sL / sK)</w:t>
+        <w:t>sK = 1 − sL</w:t>
       </w:r>
     </w:p>
     <w:p>
@@ -2225,7 +2241,7 @@
         <w:rPr>
           <w:rFonts w:ascii="Calibri" w:hAnsi="Calibri" w:cs="Calibri"/>
         </w:rPr>
-        <w:t>Δy = Δ ln(sL / sK)</w:t>
+        <w:t>y = ln(sL / sK)</w:t>
       </w:r>
     </w:p>
     <w:p>
@@ -2238,15 +2254,8 @@
       <w:r>
         <w:rPr>
           <w:rFonts w:ascii="Calibri" w:hAnsi="Calibri" w:cs="Calibri"/>
-          <w:b/>
-        </w:rPr>
-        <w:t xml:space="preserve">Construction of the regressor. </w:t>
-      </w:r>
-      <w:r>
-        <w:rPr>
-          <w:rFonts w:ascii="Calibri" w:hAnsi="Calibri" w:cs="Calibri"/>
-        </w:rPr>
-        <w:t>Capital-services growth is already provided in percentage terms and can be treated as approximately equal to Δln(K). Hours growth must instead be computed from levels:</w:t>
+        </w:rPr>
+        <w:t>Δy = Δ ln(sL / sK)</w:t>
       </w:r>
     </w:p>
     <w:p>
@@ -2259,8 +2268,15 @@
       <w:r>
         <w:rPr>
           <w:rFonts w:ascii="Calibri" w:hAnsi="Calibri" w:cs="Calibri"/>
-        </w:rPr>
-        <w:t>gK ≈ capital services growth</w:t>
+          <w:b/>
+        </w:rPr>
+        <w:t xml:space="preserve">Construction of the regressor. </w:t>
+      </w:r>
+      <w:r>
+        <w:rPr>
+          <w:rFonts w:ascii="Calibri" w:hAnsi="Calibri" w:cs="Calibri"/>
+        </w:rPr>
+        <w:t>Capital-services growth is already provided in percentage terms and can be treated as approximately equal to Δln(K). Hours growth must instead be computed from levels:</w:t>
       </w:r>
     </w:p>
     <w:p>
@@ -2274,7 +2290,7 @@
         <w:rPr>
           <w:rFonts w:ascii="Calibri" w:hAnsi="Calibri" w:cs="Calibri"/>
         </w:rPr>
-        <w:t>gH = Δ ln(HRSTO)</w:t>
+        <w:t>gK ≈ capital services growth</w:t>
       </w:r>
     </w:p>
     <w:p>
@@ -2288,7 +2304,7 @@
         <w:rPr>
           <w:rFonts w:ascii="Calibri" w:hAnsi="Calibri" w:cs="Calibri"/>
         </w:rPr>
-        <w:t>Δx = gK − gH</w:t>
+        <w:t>gH = Δ ln(HRSTO)</w:t>
       </w:r>
     </w:p>
     <w:p>
@@ -2301,15 +2317,8 @@
       <w:r>
         <w:rPr>
           <w:rFonts w:ascii="Calibri" w:hAnsi="Calibri" w:cs="Calibri"/>
-          <w:b/>
-        </w:rPr>
-        <w:t xml:space="preserve">Regression. </w:t>
-      </w:r>
-      <w:r>
-        <w:rPr>
-          <w:rFonts w:ascii="Calibri" w:hAnsi="Calibri" w:cs="Calibri"/>
-        </w:rPr>
-        <w:t>The preferred panel equation is:</w:t>
+        </w:rPr>
+        <w:t>Δx = gK − gH</w:t>
       </w:r>
     </w:p>
     <w:p>
@@ -2322,8 +2331,15 @@
       <w:r>
         <w:rPr>
           <w:rFonts w:ascii="Calibri" w:hAnsi="Calibri" w:cs="Calibri"/>
-        </w:rPr>
-        <w:t>Δy_ct = α_c + γ_t + β1 Δx_ct + u_ct</w:t>
+          <w:b/>
+        </w:rPr>
+        <w:t xml:space="preserve">Regression. </w:t>
+      </w:r>
+      <w:r>
+        <w:rPr>
+          <w:rFonts w:ascii="Calibri" w:hAnsi="Calibri" w:cs="Calibri"/>
+        </w:rPr>
+        <w:t>The preferred panel equation is:</w:t>
       </w:r>
     </w:p>
     <w:p>
@@ -2336,15 +2352,8 @@
       <w:r>
         <w:rPr>
           <w:rFonts w:ascii="Calibri" w:hAnsi="Calibri" w:cs="Calibri"/>
-          <w:b/>
-        </w:rPr>
-        <w:t xml:space="preserve">Fixed effects. </w:t>
-      </w:r>
-      <w:r>
-        <w:rPr>
-          <w:rFonts w:ascii="Calibri" w:hAnsi="Calibri" w:cs="Calibri"/>
-        </w:rPr>
-        <w:t>Country fixed effects absorb persistent structural differences across G7 economies. Time fixed effects absorb common global shocks, such as crises or commodity-price movements.</w:t>
+        </w:rPr>
+        <w:t>Δy_ct = α_c + γ_t + β1 Δx_ct + u_ct</w:t>
       </w:r>
     </w:p>
     <w:p>
@@ -2359,19 +2368,49 @@
           <w:rFonts w:ascii="Calibri" w:hAnsi="Calibri" w:cs="Calibri"/>
           <w:b/>
         </w:rPr>
-        <w:t xml:space="preserve">Charts. </w:t>
-      </w:r>
-      <w:r>
-        <w:rPr>
-          <w:rFonts w:ascii="Calibri" w:hAnsi="Calibri" w:cs="Calibri"/>
-        </w:rPr>
-        <w:t>A useful descriptive chart is a time-series scatter for one country at a time, or for at most a few benchmark countries, with X = Δx and Y = Δy. This is not a substitute for panel regression, but it is useful for visual intuition.</w:t>
+        <w:t xml:space="preserve">Fixed effects. </w:t>
+      </w:r>
+      <w:r>
+        <w:rPr>
+          <w:rFonts w:ascii="Calibri" w:hAnsi="Calibri" w:cs="Calibri"/>
+        </w:rPr>
+        <w:t>Country fixed effects absorb persistent structural differences across G7 economies. Time fixed effects absorb common global shocks, such as crises or commodity-price movements.</w:t>
       </w:r>
     </w:p>
     <w:p>
       <w:pPr>
+        <w:spacing w:after="0" w:line="240" w:lineRule="auto"/>
+        <w:rPr>
+          <w:rFonts w:ascii="Calibri" w:hAnsi="Calibri" w:cs="Calibri"/>
+        </w:rPr>
+      </w:pPr>
+      <w:r>
+        <w:rPr>
+          <w:rFonts w:ascii="Calibri" w:hAnsi="Calibri" w:cs="Calibri"/>
+          <w:b/>
+        </w:rPr>
+        <w:t xml:space="preserve">Charts. </w:t>
+      </w:r>
+      <w:r>
+        <w:rPr>
+          <w:rFonts w:ascii="Calibri" w:hAnsi="Calibri" w:cs="Calibri"/>
+        </w:rPr>
+        <w:t>A useful descriptive chart is a time-series scatter for one country at a time, or for at most a few benchmark countries, with X = Δx and Y = Δy. This is not a substitute for panel regression, but it is useful for visual intuition.</w:t>
+      </w:r>
+    </w:p>
+    <w:p>
+      <w:pPr>
         <w:pStyle w:val="Heading2"/>
-        <w:spacing w:line="240" w:lineRule="auto"/>
+        <w:spacing w:before="0" w:line="240" w:lineRule="auto"/>
+        <w:rPr>
+          <w:rFonts w:ascii="Calibri" w:hAnsi="Calibri" w:cs="Calibri"/>
+        </w:rPr>
+      </w:pPr>
+    </w:p>
+    <w:p>
+      <w:pPr>
+        <w:pStyle w:val="Heading2"/>
+        <w:spacing w:before="0" w:line="240" w:lineRule="auto"/>
         <w:rPr>
           <w:rFonts w:ascii="Calibri" w:hAnsi="Calibri" w:cs="Calibri"/>
         </w:rPr>
@@ -2797,187 +2836,6 @@
           <w:rFonts w:ascii="Calibri" w:hAnsi="Calibri" w:cs="Calibri"/>
         </w:rPr>
         <w:t>Recommended columns: country, country_code, year, labour_compensation_lc, gva, capital_services_growth_kser, hours_hrsto. For the sectoral version add economic_activity and economic_activity_code.</w:t>
-      </w:r>
-    </w:p>
-    <w:p>
-      <w:pPr>
-        <w:spacing w:after="0" w:line="240" w:lineRule="auto"/>
-        <w:rPr>
-          <w:rFonts w:ascii="Calibri" w:hAnsi="Calibri" w:cs="Calibri"/>
-        </w:rPr>
-      </w:pPr>
-    </w:p>
-    <w:p>
-      <w:pPr>
-        <w:pStyle w:val="Heading1"/>
-        <w:spacing w:before="0" w:line="240" w:lineRule="auto"/>
-        <w:rPr>
-          <w:rFonts w:ascii="Calibri" w:hAnsi="Calibri" w:cs="Calibri"/>
-        </w:rPr>
-      </w:pPr>
-      <w:r>
-        <w:rPr>
-          <w:rFonts w:ascii="Calibri" w:hAnsi="Calibri" w:cs="Calibri"/>
-        </w:rPr>
-        <w:t>8. Python workflow: correlations, charts, and regressions</w:t>
-      </w:r>
-    </w:p>
-    <w:p>
-      <w:pPr>
-        <w:spacing w:after="0" w:line="240" w:lineRule="auto"/>
-        <w:rPr>
-          <w:rFonts w:ascii="Calibri" w:hAnsi="Calibri" w:cs="Calibri"/>
-        </w:rPr>
-      </w:pPr>
-      <w:r>
-        <w:rPr>
-          <w:rFonts w:ascii="Calibri" w:hAnsi="Calibri" w:cs="Calibri"/>
-          <w:b/>
-        </w:rPr>
-        <w:t xml:space="preserve">Principle. </w:t>
-      </w:r>
-      <w:r>
-        <w:rPr>
-          <w:rFonts w:ascii="Calibri" w:hAnsi="Calibri" w:cs="Calibri"/>
-        </w:rPr>
-        <w:t>All transformations should be performed in Python rather than split between Excel and Python. This avoids duplicated logic, inconsistent formulas, and spreadsheet noise. The raw files should remain as close as possible to source data; all constructed variables should be generated programmatically.</w:t>
-      </w:r>
-    </w:p>
-    <w:p>
-      <w:pPr>
-        <w:spacing w:after="0" w:line="240" w:lineRule="auto"/>
-        <w:rPr>
-          <w:rFonts w:ascii="Calibri" w:hAnsi="Calibri" w:cs="Calibri"/>
-        </w:rPr>
-      </w:pPr>
-      <w:r>
-        <w:rPr>
-          <w:rFonts w:ascii="Calibri" w:hAnsi="Calibri" w:cs="Calibri"/>
-        </w:rPr>
-        <w:br/>
-      </w:r>
-    </w:p>
-    <w:p>
-      <w:pPr>
-        <w:pStyle w:val="Heading2"/>
-        <w:spacing w:line="240" w:lineRule="auto"/>
-        <w:rPr>
-          <w:rFonts w:ascii="Calibri" w:hAnsi="Calibri" w:cs="Calibri"/>
-        </w:rPr>
-      </w:pPr>
-      <w:r>
-        <w:rPr>
-          <w:rFonts w:ascii="Calibri" w:hAnsi="Calibri" w:cs="Calibri"/>
-        </w:rPr>
-        <w:lastRenderedPageBreak/>
-        <w:t>8.5 Notes on coding choices</w:t>
-      </w:r>
-    </w:p>
-    <w:p>
-      <w:pPr>
-        <w:spacing w:after="0" w:line="240" w:lineRule="auto"/>
-        <w:rPr>
-          <w:rFonts w:ascii="Calibri" w:hAnsi="Calibri" w:cs="Calibri"/>
-        </w:rPr>
-      </w:pPr>
-      <w:r>
-        <w:rPr>
-          <w:rFonts w:ascii="Calibri" w:hAnsi="Calibri" w:cs="Calibri"/>
-          <w:b/>
-        </w:rPr>
-        <w:t xml:space="preserve">Percent growth and log growth. </w:t>
-      </w:r>
-      <w:r>
-        <w:rPr>
-          <w:rFonts w:ascii="Calibri" w:hAnsi="Calibri" w:cs="Calibri"/>
-        </w:rPr>
-        <w:t>Capital-services growth provided by OECD in percentage terms can be treated as approximately equal to Δln(K) for the purposes of this project, especially at moderate annual growth rates. Hours growth, by contrast, should be computed exactly as a log difference from level data.</w:t>
-      </w:r>
-    </w:p>
-    <w:p>
-      <w:pPr>
-        <w:spacing w:after="0" w:line="240" w:lineRule="auto"/>
-        <w:rPr>
-          <w:rFonts w:ascii="Calibri" w:hAnsi="Calibri" w:cs="Calibri"/>
-        </w:rPr>
-      </w:pPr>
-      <w:r>
-        <w:rPr>
-          <w:rFonts w:ascii="Calibri" w:hAnsi="Calibri" w:cs="Calibri"/>
-          <w:b/>
-        </w:rPr>
-        <w:t xml:space="preserve">Correlations. </w:t>
-      </w:r>
-      <w:r>
-        <w:rPr>
-          <w:rFonts w:ascii="Calibri" w:hAnsi="Calibri" w:cs="Calibri"/>
-        </w:rPr>
-        <w:t>Correlations are included for all three models as descriptive diagnostics, not as substitutes for regression analysis. They are useful to verify sign consistency before estimation.</w:t>
-      </w:r>
-    </w:p>
-    <w:p>
-      <w:pPr>
-        <w:spacing w:after="0" w:line="240" w:lineRule="auto"/>
-        <w:rPr>
-          <w:rFonts w:ascii="Calibri" w:hAnsi="Calibri" w:cs="Calibri"/>
-        </w:rPr>
-      </w:pPr>
-      <w:r>
-        <w:rPr>
-          <w:rFonts w:ascii="Calibri" w:hAnsi="Calibri" w:cs="Calibri"/>
-          <w:b/>
-        </w:rPr>
-        <w:t xml:space="preserve">Fixed effects. </w:t>
-      </w:r>
-      <w:r>
-        <w:rPr>
-          <w:rFonts w:ascii="Calibri" w:hAnsi="Calibri" w:cs="Calibri"/>
-        </w:rPr>
-        <w:t>For the non-sectoral growth model, country and year fixed effects are sufficient. For the sectoral model, country-sector fixed effects plus year fixed effects are more appropriate.</w:t>
-      </w:r>
-    </w:p>
-    <w:p>
-      <w:pPr>
-        <w:spacing w:after="0" w:line="240" w:lineRule="auto"/>
-        <w:rPr>
-          <w:rFonts w:ascii="Calibri" w:hAnsi="Calibri" w:cs="Calibri"/>
-        </w:rPr>
-      </w:pPr>
-    </w:p>
-    <w:p>
-      <w:pPr>
-        <w:pStyle w:val="Heading1"/>
-        <w:spacing w:before="0" w:line="240" w:lineRule="auto"/>
-        <w:rPr>
-          <w:rFonts w:ascii="Calibri" w:hAnsi="Calibri" w:cs="Calibri"/>
-        </w:rPr>
-      </w:pPr>
-      <w:r>
-        <w:rPr>
-          <w:rFonts w:ascii="Calibri" w:hAnsi="Calibri" w:cs="Calibri"/>
-        </w:rPr>
-        <w:t>9. Final recommended design</w:t>
-      </w:r>
-    </w:p>
-    <w:p>
-      <w:pPr>
-        <w:spacing w:after="0" w:line="240" w:lineRule="auto"/>
-        <w:rPr>
-          <w:rFonts w:ascii="Calibri" w:hAnsi="Calibri" w:cs="Calibri"/>
-        </w:rPr>
-      </w:pPr>
-      <w:r>
-        <w:rPr>
-          <w:rFonts w:ascii="Calibri" w:hAnsi="Calibri" w:cs="Calibri"/>
-          <w:b/>
-        </w:rPr>
-        <w:t xml:space="preserve">Final recommendation. </w:t>
-      </w:r>
-      <w:r>
-        <w:rPr>
-          <w:rFonts w:ascii="Calibri" w:hAnsi="Calibri" w:cs="Calibri"/>
-        </w:rPr>
-        <w:t>Use AMECO for the cross-country level model over OECD advanced economies. Use OECD for the non-sectoral and sectoral growth models over G7 economies. Compute all transformations in Python. Use the level model as the clean theoretical benchmark, the aggregate growth model as the main dynamic check, and the sectoral growth model as the extension that brings richer heterogeneity into the analysis.</w:t>
       </w:r>
     </w:p>
     <w:sectPr>

</xml_diff>